<commit_message>
docs: sync interim report draft with reviewed doc
Apply the changes agreed in the shared doc: the explored-sample sentence,
a less specific feature-based ranker line, and a shorter related-work
paragraph citing only the JDsearch paper.

Co-Authored-By: Claude Opus 5.5 <noreply@anthropic.com>
</commit_message>
<xml_diff>
--- a/docs/interim/Group17_Interim_Report_DRAFT.docx
+++ b/docs/interim/Group17_Interim_Report_DRAFT.docx
@@ -1153,7 +1153,7 @@
         <w:spacing w:after="60" w:line="360"/>
       </w:pPr>
       <w:r>
-        <w:t xml:space="preserve">Modelling will split by whole search record. All final searches share one date and rows carry no absolute timestamps, so a cross-user temporal split is not meaningful. The 5,000 explored records will be excluded from the final test set.</w:t>
+        <w:t xml:space="preserve">Modelling will split by whole search record. All final searches share one date and rows carry no absolute timestamps, so a cross-user temporal split is not meaningful. The 5,000 records explored here have already informed our feature choices, which we will keep in mind when setting up the final evaluation.</w:t>
       </w:r>
     </w:p>
     <w:p>
@@ -11468,7 +11468,7 @@
         <w:t xml:space="preserve">Feature-based ranker:</w:t>
       </w:r>
       <w:r>
-        <w:t xml:space="preserve"> for example, gradient-boosted trees with a ranking objective over the Section 2.3 feature families.</w:t>
+        <w:t xml:space="preserve"> a learning-to-rank model over the Section 2.3 feature families, chosen after the baseline comparisons.</w:t>
       </w:r>
     </w:p>
     <w:p>
@@ -11496,7 +11496,7 @@
         <w:spacing w:after="120" w:before="120" w:line="360"/>
       </w:pPr>
       <w:r>
-        <w:t xml:space="preserve">Query-dependent attention over user history already exists in personalised product search: AEM and ZAM (Ai et al., 2019), which the JDsearch paper benchmarks, attend over a user’s items given the query, and ZAM explicitly learns how much to personalise. Our intended contribution is therefore a corrected evaluation of the prior baseline and controlled, signal-level evidence on when and how strongly history should influence search ranking.</w:t>
+        <w:t xml:space="preserve">Query-aware history models already exist; the JDsearch paper itself benchmarks several (Liu et al., 2023). Our contribution is therefore a corrected evaluation of the prior baseline and controlled evidence on when, and how strongly, history should influence search ranking.</w:t>
       </w:r>
     </w:p>
     <w:p>
@@ -11505,14 +11505,6 @@
       </w:pPr>
       <w:r>
         <w:t xml:space="preserve">References</w:t>
-      </w:r>
-    </w:p>
-    <w:p>
-      <w:pPr>
-        <w:spacing w:after="120" w:line="360"/>
-      </w:pPr>
-      <w:r>
-        <w:t xml:space="preserve">Ai, Q., Hill, D. N., Vishwanathan, S. V. N., &amp; Croft, W. B. (2019). A zero attention model for personalized product search. In Proceedings of the 28th ACM International Conference on Information and Knowledge Management (CIKM ’19).</w:t>
       </w:r>
     </w:p>
     <w:p>

</xml_diff>